<commit_message>
chore: update project documentation, presentation slides, and manuscript report files
</commit_message>
<xml_diff>
--- a/SEM_8/FRP/FRP FRONT PAGE.docx
+++ b/SEM_8/FRP/FRP FRONT PAGE.docx
@@ -51,16 +51,7 @@
               </w:rPr>
             </w:pPr>
             <w:bookmarkStart w:id="0" w:name="_GoBack"/>
-            <w:r>
-              <w:rPr>
-                <w:rFonts w:hint="default" w:ascii="Arial Regular" w:hAnsi="Arial Regular" w:cs="Arial Regular"/>
-                <w:b w:val="0"/>
-                <w:sz w:val="17"/>
-                <w:vertAlign w:val="baseline"/>
-                <w:lang w:val="en-US"/>
-              </w:rPr>
-              <w:t>a</w:t>
-            </w:r>
+            <w:bookmarkEnd w:id="0"/>
             <w:r>
               <w:rPr>
                 <w:rFonts w:hint="default" w:ascii="Arial Regular" w:hAnsi="Arial Regular" w:cs="Arial Regular"/>
@@ -2200,7 +2191,6 @@
           </w:p>
         </w:tc>
       </w:tr>
-      <w:bookmarkEnd w:id="0"/>
     </w:tbl>
     <w:p>
       <w:pPr>

</xml_diff>